<commit_message>
perstistent program loading and wiring
</commit_message>
<xml_diff>
--- a/docs/Lattice-DRTOS-Architecture-White-Paper.docx
+++ b/docs/Lattice-DRTOS-Architecture-White-Paper.docx
@@ -1523,37 +1523,99 @@
         <w:pStyle w:val="FirstParagraph"/>
       </w:pPr>
       <w:r>
-        <w:t xml:space="preserve">A saved memory reference can serve as an identity after shutdown. On reconstruction,</w:t>
-      </w:r>
-      <w:r>
-        <w:t xml:space="preserve"> </w:t>
-      </w:r>
-      <w:r>
-        <w:t xml:space="preserve">manual graph traversal establishes the correspondence between saved identities and new</w:t>
-      </w:r>
-      <w:r>
-        <w:t xml:space="preserve"> </w:t>
-      </w:r>
-      <w:r>
-        <w:t xml:space="preserve">local addresses and fixes each relationship. A multi-node reference adds the owning node's</w:t>
-      </w:r>
-      <w:r>
-        <w:t xml:space="preserve"> </w:t>
-      </w:r>
-      <w:r>
-        <w:t xml:space="preserve">identity to this reconstruction domain. Boot, replacement, and slot reuse must distinguish</w:t>
-      </w:r>
-      <w:r>
-        <w:t xml:space="preserve"> </w:t>
-      </w:r>
-      <w:r>
-        <w:t xml:space="preserve">a new binding incarnation from delayed traffic for its previous occupant. The compact</w:t>
-      </w:r>
-      <w:r>
-        <w:t xml:space="preserve"> </w:t>
-      </w:r>
-      <w:r>
-        <w:t xml:space="preserve">encoding and reuse bounds remain an ABI obligation.</w:t>
+        <w:t xml:space="preserve">Native appliance states and mutation functions have durable owner-local bindings.</w:t>
+      </w:r>
+      <w:r>
+        <w:t xml:space="preserve"> </w:t>
+      </w:r>
+      <w:r>
+        <w:t xml:space="preserve">Their declarations supply permanent binding names; the kernel converts those names</w:t>
+      </w:r>
+      <w:r>
+        <w:t xml:space="preserve"> </w:t>
+      </w:r>
+      <w:r>
+        <w:t xml:space="preserve">to numeric references and resolves them to the current native handles. Names are</w:t>
+      </w:r>
+      <w:r>
+        <w:t xml:space="preserve"> </w:t>
+      </w:r>
+      <w:r>
+        <w:t xml:space="preserve">not display labels, Rust type names, enumeration positions or transmitted strings.</w:t>
+      </w:r>
+      <w:r>
+        <w:t xml:space="preserve"> </w:t>
+      </w:r>
+      <w:r>
+        <w:t xml:space="preserve">Compatible firmware relocation must preserve those references. Reusing a name for</w:t>
+      </w:r>
+      <w:r>
+        <w:t xml:space="preserve"> </w:t>
+      </w:r>
+      <w:r>
+        <w:t xml:space="preserve">a different physical meaning is an incompatible change, even if its type matches.</w:t>
+      </w:r>
+      <w:r>
+        <w:t xml:space="preserve"> </w:t>
+      </w:r>
+      <w:r>
+        <w:t xml:space="preserve">Duplicate references must be rejected rather than ambiguously dispatched.</w:t>
+      </w:r>
+    </w:p>
+    <w:p>
+      <w:pPr>
+        <w:pStyle w:val="BodyText"/>
+      </w:pPr>
+      <w:r>
+        <w:t xml:space="preserve">On reconstruction, graph traversal resolves saved native bindings and fixes local</w:t>
+      </w:r>
+      <w:r>
+        <w:t xml:space="preserve"> </w:t>
+      </w:r>
+      <w:r>
+        <w:t xml:space="preserve">relationships after checking types and compatibility. A multi-node reference adds</w:t>
+      </w:r>
+      <w:r>
+        <w:t xml:space="preserve"> </w:t>
+      </w:r>
+      <w:r>
+        <w:t xml:space="preserve">the owning node's identity to this reconstruction domain. Mathematical definitions</w:t>
+      </w:r>
+      <w:r>
+        <w:t xml:space="preserve"> </w:t>
+      </w:r>
+      <w:r>
+        <w:t xml:space="preserve">and surface compatibility fingerprints must not depend on firmware addresses.</w:t>
+      </w:r>
+      <w:r>
+        <w:t xml:space="preserve"> </w:t>
+      </w:r>
+      <w:r>
+        <w:t xml:space="preserve">Installed graph storage has separate incarnation/reuse rules: boot, replacement</w:t>
+      </w:r>
+      <w:r>
+        <w:t xml:space="preserve"> </w:t>
+      </w:r>
+      <w:r>
+        <w:t xml:space="preserve">and reuse must distinguish a new binding from delayed traffic for its previous</w:t>
+      </w:r>
+      <w:r>
+        <w:t xml:space="preserve"> </w:t>
+      </w:r>
+      <w:r>
+        <w:t xml:space="preserve">occupant. Stable native names do not establish that a changed program or hardware</w:t>
+      </w:r>
+      <w:r>
+        <w:t xml:space="preserve"> </w:t>
+      </w:r>
+      <w:r>
+        <w:t xml:space="preserve">implementation is compatible. Concrete record and installation formats belong</w:t>
+      </w:r>
+      <w:r>
+        <w:t xml:space="preserve"> </w:t>
+      </w:r>
+      <w:r>
+        <w:t xml:space="preserve">with the kernel implementation.</w:t>
       </w:r>
     </w:p>
     <w:p>
@@ -1613,13 +1675,13 @@
         <w:t xml:space="preserve"> </w:t>
       </w:r>
       <w:r>
-        <w:t xml:space="preserve">hosted on every vertex. The concrete resident-record and loading ABI still requires</w:t>
-      </w:r>
-      <w:r>
-        <w:t xml:space="preserve"> </w:t>
-      </w:r>
-      <w:r>
-        <w:t xml:space="preserve">design.</w:t>
+        <w:t xml:space="preserve">hosted on every vertex. Concrete resident-record and installation formats are</w:t>
+      </w:r>
+      <w:r>
+        <w:t xml:space="preserve"> </w:t>
+      </w:r>
+      <w:r>
+        <w:t xml:space="preserve">maintained with the kernel implementation.</w:t>
       </w:r>
     </w:p>
     <w:p>
@@ -4394,6 +4456,38 @@
       </w:r>
       <w:r>
         <w:t xml:space="preserve">change the peripheral again.</w:t>
+      </w:r>
+    </w:p>
+    <w:p>
+      <w:pPr>
+        <w:pStyle w:val="BodyText"/>
+      </w:pPr>
+      <w:r>
+        <w:t xml:space="preserve">Initial enablement likewise admits one fresh evaluation before ordinary delta-driven</w:t>
+      </w:r>
+      <w:r>
+        <w:t xml:space="preserve"> </w:t>
+      </w:r>
+      <w:r>
+        <w:t xml:space="preserve">operation. After a reboot, a restored enabled head evaluates current conditions once</w:t>
+      </w:r>
+      <w:r>
+        <w:t xml:space="preserve"> </w:t>
+      </w:r>
+      <w:r>
+        <w:t xml:space="preserve">its required local state/time are available. This is a new traversal with current</w:t>
+      </w:r>
+      <w:r>
+        <w:t xml:space="preserve"> </w:t>
+      </w:r>
+      <w:r>
+        <w:t xml:space="preserve">inputs, never replay of an interrupted traversal or mutation. Repeated delivery of</w:t>
+      </w:r>
+      <w:r>
+        <w:t xml:space="preserve"> </w:t>
+      </w:r>
+      <w:r>
+        <w:t xml:space="preserve">the same enable request must not manufacture additional enablement evaluations.</w:t>
       </w:r>
     </w:p>
     <w:p>

</xml_diff>

<commit_message>
Enablement and traversal execution
</commit_message>
<xml_diff>
--- a/docs/Lattice-DRTOS-Architecture-White-Paper.docx
+++ b/docs/Lattice-DRTOS-Architecture-White-Paper.docx
@@ -3060,19 +3060,49 @@
         <w:t xml:space="preserve"> </w:t>
       </w:r>
       <w:r>
-        <w:t xml:space="preserve">promptly. Missing receipts must nevertheless have bounded consequences; they cannot</w:t>
-      </w:r>
-      <w:r>
-        <w:t xml:space="preserve"> </w:t>
-      </w:r>
-      <w:r>
-        <w:t xml:space="preserve">justify immortal retry entries. Ring slots, retry limits, identity windows, and eviction</w:t>
-      </w:r>
-      <w:r>
-        <w:t xml:space="preserve"> </w:t>
-      </w:r>
-      <w:r>
-        <w:t xml:space="preserve">are part of the protocol contract, not an unbounded dynamic cache.</w:t>
+        <w:t xml:space="preserve">promptly. Storage for outstanding work is bounded. Under pressure, accepted traversals</w:t>
+      </w:r>
+      <w:r>
+        <w:t xml:space="preserve"> </w:t>
+      </w:r>
+      <w:r>
+        <w:t xml:space="preserve">remain owned by their current holder; a receiver without capacity returns Busy so the</w:t>
+      </w:r>
+      <w:r>
+        <w:t xml:space="preserve"> </w:t>
+      </w:r>
+      <w:r>
+        <w:t xml:space="preserve">sender retains and retries the same work with capped backoff. An unavailable peer may</w:t>
+      </w:r>
+      <w:r>
+        <w:t xml:space="preserve"> </w:t>
+      </w:r>
+      <w:r>
+        <w:t xml:space="preserve">therefore occupy bounded execution capacity until delivery can proceed. Incomplete,</w:t>
+      </w:r>
+      <w:r>
+        <w:t xml:space="preserve"> </w:t>
+      </w:r>
+      <w:r>
+        <w:t xml:space="preserve">unaccepted reservations and completed-delivery receipts can expire under explicit</w:t>
+      </w:r>
+      <w:r>
+        <w:t xml:space="preserve"> </w:t>
+      </w:r>
+      <w:r>
+        <w:t xml:space="preserve">identity rules; their expiry must never turn a retransmission into another invocation.</w:t>
+      </w:r>
+      <w:r>
+        <w:t xml:space="preserve"> </w:t>
+      </w:r>
+      <w:r>
+        <w:t xml:space="preserve">Uncertain acceptance after lost receipt history is reported rather than re-created as</w:t>
+      </w:r>
+      <w:r>
+        <w:t xml:space="preserve"> </w:t>
+      </w:r>
+      <w:r>
+        <w:t xml:space="preserve">new work. No unbounded dynamic cache is introduced.</w:t>
       </w:r>
     </w:p>
     <w:p>
@@ -4469,25 +4499,69 @@
         <w:t xml:space="preserve"> </w:t>
       </w:r>
       <w:r>
-        <w:t xml:space="preserve">operation. After a reboot, a restored enabled head evaluates current conditions once</w:t>
-      </w:r>
-      <w:r>
-        <w:t xml:space="preserve"> </w:t>
-      </w:r>
-      <w:r>
-        <w:t xml:space="preserve">its required local state/time are available. This is a new traversal with current</w:t>
-      </w:r>
-      <w:r>
-        <w:t xml:space="preserve"> </w:t>
-      </w:r>
-      <w:r>
-        <w:t xml:space="preserve">inputs, never replay of an interrupted traversal or mutation. Repeated delivery of</w:t>
-      </w:r>
-      <w:r>
-        <w:t xml:space="preserve"> </w:t>
-      </w:r>
-      <w:r>
-        <w:t xml:space="preserve">the same enable request must not manufacture additional enablement evaluations.</w:t>
+        <w:t xml:space="preserve">operation. Repeated delivery of the same enable request must not manufacture additional</w:t>
+      </w:r>
+      <w:r>
+        <w:t xml:space="preserve"> </w:t>
+      </w:r>
+      <w:r>
+        <w:t xml:space="preserve">enablement evaluations.</w:t>
+      </w:r>
+    </w:p>
+    <w:p>
+      <w:pPr>
+        <w:pStyle w:val="BodyText"/>
+      </w:pPr>
+      <w:r>
+        <w:t xml:space="preserve">Reboot recovery temporarily uses fresh activations once the restored local state/time</w:t>
+      </w:r>
+      <w:r>
+        <w:t xml:space="preserve"> </w:t>
+      </w:r>
+      <w:r>
+        <w:t xml:space="preserve">are available. Recovery at a dependency-bearing binding follows its ordinary upstream</w:t>
+      </w:r>
+      <w:r>
+        <w:t xml:space="preserve"> </w:t>
+      </w:r>
+      <w:r>
+        <w:t xml:space="preserve">relationships; it cannot rely on the head also rebooting. The enabled head admits the</w:t>
+      </w:r>
+      <w:r>
+        <w:t xml:space="preserve"> </w:t>
+      </w:r>
+      <w:r>
+        <w:t xml:space="preserve">resulting forward evaluation with current inputs, never by replaying an interrupted</w:t>
+      </w:r>
+      <w:r>
+        <w:t xml:space="preserve"> </w:t>
+      </w:r>
+      <w:r>
+        <w:t xml:space="preserve">mutation. These independently originated recovery activations can produce repeated</w:t>
+      </w:r>
+      <w:r>
+        <w:t xml:space="preserve"> </w:t>
+      </w:r>
+      <w:r>
+        <w:t xml:space="preserve">evaluations of the same program as its participants return. A single head does not</w:t>
+      </w:r>
+      <w:r>
+        <w:t xml:space="preserve"> </w:t>
+      </w:r>
+      <w:r>
+        <w:t xml:space="preserve">deduplicate them, and ordinary delivery duplicate suppression does not merge them.</w:t>
+      </w:r>
+      <w:r>
+        <w:t xml:space="preserve"> </w:t>
+      </w:r>
+      <w:r>
+        <w:t xml:space="preserve">Coordinated reconciliation after an outage remains deferred. This temporary policy</w:t>
+      </w:r>
+      <w:r>
+        <w:t xml:space="preserve"> </w:t>
+      </w:r>
+      <w:r>
+        <w:t xml:space="preserve">does not establish once-per-program recovery across a network restart.</w:t>
       </w:r>
     </w:p>
     <w:p>
@@ -5455,37 +5529,37 @@
         <w:pStyle w:val="BodyText"/>
       </w:pPr>
       <w:r>
-        <w:t xml:space="preserve">The full-buffer policy is still a design obligation. An implementation must distinguish</w:t>
-      </w:r>
-      <w:r>
-        <w:t xml:space="preserve"> </w:t>
-      </w:r>
-      <w:r>
-        <w:t xml:space="preserve">work not yet accepted from work it has already acknowledged. Possible mechanisms include</w:t>
-      </w:r>
-      <w:r>
-        <w:t xml:space="preserve"> </w:t>
-      </w:r>
-      <w:r>
-        <w:t xml:space="preserve">upstream retry, reserved critical traffic capacity, explicit rejection, and scoped fault</w:t>
-      </w:r>
-      <w:r>
-        <w:t xml:space="preserve"> </w:t>
-      </w:r>
-      <w:r>
-        <w:t xml:space="preserve">escalation; the final combination must be selected and tested rather than silently</w:t>
-      </w:r>
-      <w:r>
-        <w:t xml:space="preserve"> </w:t>
-      </w:r>
-      <w:r>
-        <w:t xml:space="preserve">assumed. Physical state changes can arrive faster than an overloaded link drains, so</w:t>
-      </w:r>
-      <w:r>
-        <w:t xml:space="preserve"> </w:t>
-      </w:r>
-      <w:r>
-        <w:t xml:space="preserve">backpressure alone cannot make arbitrary arrival rates lossless.</w:t>
+        <w:t xml:space="preserve">The admission policy preserves accepted work. A receiver without free execution capacity</w:t>
+      </w:r>
+      <w:r>
+        <w:t xml:space="preserve"> </w:t>
+      </w:r>
+      <w:r>
+        <w:t xml:space="preserve">returns Busy before accepting a visit; its sender retains that visit for retry. The</w:t>
+      </w:r>
+      <w:r>
+        <w:t xml:space="preserve"> </w:t>
+      </w:r>
+      <w:r>
+        <w:t xml:space="preserve">bounded local-change buffer reports overflow when full rather than evicting earlier</w:t>
+      </w:r>
+      <w:r>
+        <w:t xml:space="preserve"> </w:t>
+      </w:r>
+      <w:r>
+        <w:t xml:space="preserve">pending activations. This is distinct from the outward observation transport ring's</w:t>
+      </w:r>
+      <w:r>
+        <w:t xml:space="preserve"> </w:t>
+      </w:r>
+      <w:r>
+        <w:t xml:space="preserve">existing hard eviction. Physical state changes can arrive faster than an overloaded</w:t>
+      </w:r>
+      <w:r>
+        <w:t xml:space="preserve"> </w:t>
+      </w:r>
+      <w:r>
+        <w:t xml:space="preserve">link drains, so backpressure alone cannot make arbitrary arrival rates lossless.</w:t>
       </w:r>
     </w:p>
     <w:p>

</xml_diff>

<commit_message>
Added proper fragement dedup and removal
</commit_message>
<xml_diff>
--- a/docs/Lattice-DRTOS-Architecture-White-Paper.docx
+++ b/docs/Lattice-DRTOS-Architecture-White-Paper.docx
@@ -895,6 +895,50 @@
         <w:pStyle w:val="BodyText"/>
       </w:pPr>
       <w:r>
+        <w:t xml:space="preserve">Use the MCU's event routing, timer compare, capture/counter, DMA and waveform</w:t>
+      </w:r>
+      <w:r>
+        <w:t xml:space="preserve"> </w:t>
+      </w:r>
+      <w:r>
+        <w:t xml:space="preserve">peripherals where they implement the hardware binding's behavior directly.</w:t>
+      </w:r>
+      <w:r>
+        <w:t xml:space="preserve"> </w:t>
+      </w:r>
+      <w:r>
+        <w:t xml:space="preserve">Event-capable acquisition is a required kernel path; a uniform periodic scan is</w:t>
+      </w:r>
+      <w:r>
+        <w:t xml:space="preserve"> </w:t>
+      </w:r>
+      <w:r>
+        <w:t xml:space="preserve">not its substitute. Acquisition sources and any necessary sampling cadence belong</w:t>
+      </w:r>
+      <w:r>
+        <w:t xml:space="preserve"> </w:t>
+      </w:r>
+      <w:r>
+        <w:t xml:space="preserve">to the hardware binding. The kernel owns their wakeup, observation and delta flow.</w:t>
+      </w:r>
+      <w:r>
+        <w:t xml:space="preserve"> </w:t>
+      </w:r>
+      <w:r>
+        <w:t xml:space="preserve">Keep an interrupt notification distinct from an acquired state change, and retain</w:t>
+      </w:r>
+      <w:r>
+        <w:t xml:space="preserve"> </w:t>
+      </w:r>
+      <w:r>
+        <w:t xml:space="preserve">events or samples in hardware/bounded storage when their individual values matter.</w:t>
+      </w:r>
+    </w:p>
+    <w:p>
+      <w:pPr>
+        <w:pStyle w:val="BodyText"/>
+      </w:pPr>
+      <w:r>
         <w:t xml:space="preserve">A mutation calls the supplied hardware function. Subsequent acquisition establishes</w:t>
       </w:r>
       <w:r>
@@ -1037,13 +1081,43 @@
         <w:t xml:space="preserve"> </w:t>
       </w:r>
       <w:r>
-        <w:t xml:space="preserve">Kernel-owned physical acquisition is distinct from polling programs for truth. Concrete</w:t>
-      </w:r>
-      <w:r>
-        <w:t xml:space="preserve"> </w:t>
-      </w:r>
-      <w:r>
-        <w:t xml:space="preserve">hardware binding signatures remain implementation design work.</w:t>
+        <w:t xml:space="preserve">Kernel-owned physical acquisition is distinct from polling programs for truth.</w:t>
+      </w:r>
+      <w:r>
+        <w:t xml:space="preserve"> </w:t>
+      </w:r>
+      <w:r>
+        <w:t xml:space="preserve">Each state identifies its physical acquisition source: an event, a sampling interval,</w:t>
+      </w:r>
+      <w:r>
+        <w:t xml:space="preserve"> </w:t>
+      </w:r>
+      <w:r>
+        <w:t xml:space="preserve">or acquisition at kernel invocation boundaries. A readiness event can be shared by</w:t>
+      </w:r>
+      <w:r>
+        <w:t xml:space="preserve"> </w:t>
+      </w:r>
+      <w:r>
+        <w:t xml:space="preserve">coupled states. The kernel takes the startup baseline, selects getters and maintains</w:t>
+      </w:r>
+      <w:r>
+        <w:t xml:space="preserve"> </w:t>
+      </w:r>
+      <w:r>
+        <w:t xml:space="preserve">the observation/delta path. Existing getter-only adapters may retain their fallback</w:t>
+      </w:r>
+      <w:r>
+        <w:t xml:space="preserve"> </w:t>
+      </w:r>
+      <w:r>
+        <w:t xml:space="preserve">sampling behavior without changing their source. Peripheral register/interrupt</w:t>
+      </w:r>
+      <w:r>
+        <w:t xml:space="preserve"> </w:t>
+      </w:r>
+      <w:r>
+        <w:t xml:space="preserve">wiring belongs to the hardware binding; it introduces no networking responsibility.</w:t>
       </w:r>
     </w:p>
     <w:p>
@@ -3143,6 +3217,38 @@
         <w:t xml:space="preserve"> </w:t>
       </w:r>
       <w:r>
+        <w:t xml:space="preserve">Opening a control stream binds its forwarding path as well as its native function.</w:t>
+      </w:r>
+      <w:r>
+        <w:t xml:space="preserve"> </w:t>
+      </w:r>
+      <w:r>
+        <w:t xml:space="preserve">Each participating relay retains the adjacent directions for that stream. Subsequent</w:t>
+      </w:r>
+      <w:r>
+        <w:t xml:space="preserve"> </w:t>
+      </w:r>
+      <w:r>
+        <w:t xml:space="preserve">updates carry a stream handle, ordering information and raw argument bytes; the type,</w:t>
+      </w:r>
+      <w:r>
+        <w:t xml:space="preserve"> </w:t>
+      </w:r>
+      <w:r>
+        <w:t xml:space="preserve">function and end-to-end addresses belong to the binding. A lost binding interrupts</w:t>
+      </w:r>
+      <w:r>
+        <w:t xml:space="preserve"> </w:t>
+      </w:r>
+      <w:r>
+        <w:t xml:space="preserve">the stream. It must be reopened with fresh input, not silently rerouted or replayed.</w:t>
+      </w:r>
+    </w:p>
+    <w:p>
+      <w:pPr>
+        <w:pStyle w:val="BodyText"/>
+      </w:pPr>
+      <w:r>
         <w:t xml:space="preserve">Feedback belongs to the participating peers rather than a guarantee that every vertex</w:t>
       </w:r>
       <w:r>
@@ -4379,6 +4485,244 @@
         <w:t xml:space="preserve">Installation replacement and enablement</w:t>
       </w:r>
       <w:bookmarkEnd w:id="50"/>
+    </w:p>
+    <w:p>
+      <w:pPr>
+        <w:pStyle w:val="Heading3"/>
+      </w:pPr>
+      <w:bookmarkStart w:id="51" w:name="_64ff59c60d01bcb563595f2409f21d05b2f1370"/>
+      <w:r>
+        <w:t xml:space="preserve">Vertex-owned fragment sharing</w:t>
+      </w:r>
+      <w:bookmarkEnd w:id="51"/>
+    </w:p>
+    <w:p>
+      <w:pPr>
+        <w:pStyle w:val="FirstParagraph"/>
+      </w:pPr>
+      <w:r>
+        <w:t xml:space="preserve">The compiler composes the intended logic, partitions it by ownership of its inputs</w:t>
+      </w:r>
+      <w:r>
+        <w:t xml:space="preserve"> </w:t>
+      </w:r>
+      <w:r>
+        <w:t xml:space="preserve">and hardware operations, and sends each vertex its local fragment and graph</w:t>
+      </w:r>
+      <w:r>
+        <w:t xml:space="preserve"> </w:t>
+      </w:r>
+      <w:r>
+        <w:t xml:space="preserve">connections. It does not inspect a remote fragment catalog to arrange reuse or</w:t>
+      </w:r>
+      <w:r>
+        <w:t xml:space="preserve"> </w:t>
+      </w:r>
+      <w:r>
+        <w:t xml:space="preserve">remain online to reconcile adjacency. An automation is a description of graph</w:t>
+      </w:r>
+      <w:r>
+        <w:t xml:space="preserve"> </w:t>
+      </w:r>
+      <w:r>
+        <w:t xml:space="preserve">behavior, not a separate runtime entity owning copies of fragments on each vertex.</w:t>
+      </w:r>
+    </w:p>
+    <w:p>
+      <w:pPr>
+        <w:pStyle w:val="BodyText"/>
+      </w:pPr>
+      <w:r>
+        <w:t xml:space="preserve">Each vertex performs local matching during installation. When the same computation</w:t>
+      </w:r>
+      <w:r>
+        <w:t xml:space="preserve"> </w:t>
+      </w:r>
+      <w:r>
+        <w:t xml:space="preserve">already exists, it retains that computation once and adds the incoming fragment's</w:t>
+      </w:r>
+      <w:r>
+        <w:t xml:space="preserve"> </w:t>
+      </w:r>
+      <w:r>
+        <w:t xml:space="preserve">paired upstream/downstream references. The pairs remain associated; two unrelated</w:t>
+      </w:r>
+      <w:r>
+        <w:t xml:space="preserve"> </w:t>
+      </w:r>
+      <w:r>
+        <w:t xml:space="preserve">upstream and downstream lists must not create new cross-connections. Removing a</w:t>
+      </w:r>
+      <w:r>
+        <w:t xml:space="preserve"> </w:t>
+      </w:r>
+      <w:r>
+        <w:t xml:space="preserve">path removes its relevant reference pair. Other pairs keep the shared computation</w:t>
+      </w:r>
+      <w:r>
+        <w:t xml:space="preserve"> </w:t>
+      </w:r>
+      <w:r>
+        <w:t xml:space="preserve">installed; removal of the final pair permits reclaiming the computation once</w:t>
+      </w:r>
+      <w:r>
+        <w:t xml:space="preserve"> </w:t>
+      </w:r>
+      <w:r>
+        <w:t xml:space="preserve">local users of its storage have been detached. Appliance states and native</w:t>
+      </w:r>
+      <w:r>
+        <w:t xml:space="preserve"> </w:t>
+      </w:r>
+      <w:r>
+        <w:t xml:space="preserve">functions keep their existing ownership and are not removed with a graph path.</w:t>
+      </w:r>
+    </w:p>
+    <w:p>
+      <w:pPr>
+        <w:pStyle w:val="BodyText"/>
+      </w:pPr>
+      <w:r>
+        <w:t xml:space="preserve">Sharing stored computation does not merge evaluations or their read/write heads.</w:t>
+      </w:r>
+      <w:r>
+        <w:t xml:space="preserve"> </w:t>
+      </w:r>
+      <w:r>
+        <w:t xml:space="preserve">A forward evaluation addresses one paired connection and follows only that pair's</w:t>
+      </w:r>
+      <w:r>
+        <w:t xml:space="preserve"> </w:t>
+      </w:r>
+      <w:r>
+        <w:t xml:space="preserve">authored continuation, subject to its local predicate/branch result. Sharing the</w:t>
+      </w:r>
+      <w:r>
+        <w:t xml:space="preserve"> </w:t>
+      </w:r>
+      <w:r>
+        <w:t xml:space="preserve">computation or the upstream physical vertex does not establish the preceding</w:t>
+      </w:r>
+      <w:r>
+        <w:t xml:space="preserve"> </w:t>
+      </w:r>
+      <w:r>
+        <w:t xml:space="preserve">conditions or carried values of another pair. It must not cause execution through</w:t>
+      </w:r>
+      <w:r>
+        <w:t xml:space="preserve"> </w:t>
+      </w:r>
+      <w:r>
+        <w:t xml:space="preserve">that other pair. A new local state delta can initiate separate upstream activations</w:t>
+      </w:r>
+      <w:r>
+        <w:t xml:space="preserve"> </w:t>
+      </w:r>
+      <w:r>
+        <w:t xml:space="preserve">for multiple affected relationships; each still undergoes its own forward path.</w:t>
+      </w:r>
+    </w:p>
+    <w:p>
+      <w:pPr>
+        <w:pStyle w:val="Heading3"/>
+      </w:pPr>
+      <w:bookmarkStart w:id="52" w:name="_fab03671a1d9a8524c807259bd4869533331e2f"/>
+      <w:r>
+        <w:t xml:space="preserve">Explicit removal</w:t>
+      </w:r>
+      <w:bookmarkEnd w:id="52"/>
+    </w:p>
+    <w:p>
+      <w:pPr>
+        <w:pStyle w:val="FirstParagraph"/>
+      </w:pPr>
+      <w:r>
+        <w:t xml:space="preserve">Explicit removal takes effect when that vertex processes the addressed deletion</w:t>
+      </w:r>
+      <w:r>
+        <w:t xml:space="preserve"> </w:t>
+      </w:r>
+      <w:r>
+        <w:t xml:space="preserve">command. Ready local evaluations are dispatched in admission order before a later</w:t>
+      </w:r>
+      <w:r>
+        <w:t xml:space="preserve"> </w:t>
+      </w:r>
+      <w:r>
+        <w:t xml:space="preserve">command; a computation already executing in that handler is not interrupted by</w:t>
+      </w:r>
+      <w:r>
+        <w:t xml:space="preserve"> </w:t>
+      </w:r>
+      <w:r>
+        <w:t xml:space="preserve">another message. Waiting for remote traffic or a hardware function does not block</w:t>
+      </w:r>
+      <w:r>
+        <w:t xml:space="preserve"> </w:t>
+      </w:r>
+      <w:r>
+        <w:t xml:space="preserve">all other local events. There is no network-wide execution stack or drain authority.</w:t>
+      </w:r>
+    </w:p>
+    <w:p>
+      <w:pPr>
+        <w:pStyle w:val="BodyText"/>
+      </w:pPr>
+      <w:r>
+        <w:t xml:space="preserve">Removal detaches the selected connections and their pending source notifications.</w:t>
+      </w:r>
+      <w:r>
+        <w:t xml:space="preserve"> </w:t>
+      </w:r>
+      <w:r>
+        <w:t xml:space="preserve">Subsequent continuations addressed to them stop there. A native hardware function</w:t>
+      </w:r>
+      <w:r>
+        <w:t xml:space="preserve"> </w:t>
+      </w:r>
+      <w:r>
+        <w:t xml:space="preserve">already running finishes; its detached continuation cannot follow the removed</w:t>
+      </w:r>
+      <w:r>
+        <w:t xml:space="preserve"> </w:t>
+      </w:r>
+      <w:r>
+        <w:t xml:space="preserve">edges. A call that has not started is canceled. A message already delivered beyond</w:t>
+      </w:r>
+      <w:r>
+        <w:t xml:space="preserve"> </w:t>
+      </w:r>
+      <w:r>
+        <w:t xml:space="preserve">this vertex cannot be recalled; another vertex applies deletion when it receives</w:t>
+      </w:r>
+      <w:r>
+        <w:t xml:space="preserve"> </w:t>
+      </w:r>
+      <w:r>
+        <w:t xml:space="preserve">its own command. This is distinct from replacement's deliberate drain policy below.</w:t>
+      </w:r>
+      <w:r>
+        <w:t xml:space="preserve"> </w:t>
+      </w:r>
+      <w:r>
+        <w:t xml:space="preserve">Storage reuse must preserve generation identity so delayed traffic cannot bind to</w:t>
+      </w:r>
+      <w:r>
+        <w:t xml:space="preserve"> </w:t>
+      </w:r>
+      <w:r>
+        <w:t xml:space="preserve">a new connection occupying the same address.</w:t>
+      </w:r>
+    </w:p>
+    <w:p>
+      <w:pPr>
+        <w:pStyle w:val="Heading3"/>
+      </w:pPr>
+      <w:bookmarkStart w:id="53" w:name="_ee2bb3c3227fc4bcb42d35bec3679652fdcc660"/>
+      <w:r>
+        <w:t xml:space="preserve">Replacement lifecycle</w:t>
+      </w:r>
+      <w:bookmarkEnd w:id="53"/>
     </w:p>
     <w:p>
       <w:pPr>
@@ -4625,18 +4969,18 @@
           <wp:inline>
             <wp:extent cx="5334000" cy="2262909"/>
             <wp:effectExtent b="0" l="0" r="0" t="0"/>
-            <wp:docPr descr="Replacement" title="" id="52" name="Picture"/>
+            <wp:docPr descr="Replacement" title="" id="55" name="Picture"/>
             <a:graphic>
               <a:graphicData uri="http://schemas.openxmlformats.org/drawingml/2006/picture">
                 <pic:pic>
                   <pic:nvPicPr>
-                    <pic:cNvPr descr="assets/architecture/replacement.png" id="53" name="Picture"/>
+                    <pic:cNvPr descr="assets/architecture/replacement.png" id="56" name="Picture"/>
                     <pic:cNvPicPr>
                       <a:picLocks noChangeArrowheads="1" noChangeAspect="1"/>
                     </pic:cNvPicPr>
                   </pic:nvPicPr>
                   <pic:blipFill>
-                    <a:blip r:embed="rId51"/>
+                    <a:blip r:embed="rId54"/>
                     <a:stretch>
                       <a:fillRect/>
                     </a:stretch>
@@ -4713,11 +5057,11 @@
       <w:pPr>
         <w:pStyle w:val="Heading3"/>
       </w:pPr>
-      <w:bookmarkStart w:id="54" w:name="_e8620c825e7ea50122f3d834c9e7f7ac80b1d5c"/>
+      <w:bookmarkStart w:id="57" w:name="_e8620c825e7ea50122f3d834c9e7f7ac80b1d5c"/>
       <w:r>
         <w:t xml:space="preserve">What still needs a protocol</w:t>
       </w:r>
-      <w:bookmarkEnd w:id="54"/>
+      <w:bookmarkEnd w:id="57"/>
     </w:p>
     <w:p>
       <w:pPr>
@@ -4761,11 +5105,11 @@
       <w:pPr>
         <w:pStyle w:val="Heading3"/>
       </w:pPr>
-      <w:bookmarkStart w:id="55" w:name="_944712bbe86e18b33a270dae4bc954b56fd72b0"/>
+      <w:bookmarkStart w:id="58" w:name="_944712bbe86e18b33a270dae4bc954b56fd72b0"/>
       <w:r>
         <w:t xml:space="preserve">Enablement is part of the graph</w:t>
       </w:r>
-      <w:bookmarkEnd w:id="55"/>
+      <w:bookmarkEnd w:id="58"/>
     </w:p>
     <w:p>
       <w:pPr>
@@ -4943,11 +5287,11 @@
       <w:pPr>
         <w:pStyle w:val="Heading2"/>
       </w:pPr>
-      <w:bookmarkStart w:id="56" w:name="_5268ca556154ae4d74eb66a6a45b3e8fcf1744c"/>
+      <w:bookmarkStart w:id="59" w:name="_5268ca556154ae4d74eb66a6a45b3e8fcf1744c"/>
       <w:r>
         <w:t xml:space="preserve">Persistence reconstruction and recovery</w:t>
       </w:r>
-      <w:bookmarkEnd w:id="56"/>
+      <w:bookmarkEnd w:id="59"/>
     </w:p>
     <w:p>
       <w:pPr>
@@ -5011,11 +5355,11 @@
       <w:pPr>
         <w:pStyle w:val="Heading3"/>
       </w:pPr>
-      <w:bookmarkStart w:id="57" w:name="_cd558f14a5ab81a0622fb16892c2426616ab4cb"/>
+      <w:bookmarkStart w:id="60" w:name="_cd558f14a5ab81a0622fb16892c2426616ab4cb"/>
       <w:r>
         <w:t xml:space="preserve">Protected local configuration</w:t>
       </w:r>
-      <w:bookmarkEnd w:id="57"/>
+      <w:bookmarkEnd w:id="60"/>
     </w:p>
     <w:p>
       <w:pPr>
@@ -5091,11 +5435,11 @@
       <w:pPr>
         <w:pStyle w:val="Heading3"/>
       </w:pPr>
-      <w:bookmarkStart w:id="58" w:name="_b482f6cb385b743a1878a2f06ac59aa2842eecc"/>
+      <w:bookmarkStart w:id="61" w:name="_b482f6cb385b743a1878a2f06ac59aa2842eecc"/>
       <w:r>
         <w:t xml:space="preserve">Boot reconstructs relationships</w:t>
       </w:r>
-      <w:bookmarkEnd w:id="58"/>
+      <w:bookmarkEnd w:id="61"/>
     </w:p>
     <w:p>
       <w:pPr>
@@ -5165,11 +5509,11 @@
       <w:pPr>
         <w:pStyle w:val="Heading3"/>
       </w:pPr>
-      <w:bookmarkStart w:id="59" w:name="_34cdd4da43187dcb8dcb7dab8cfc754babbf6ae"/>
+      <w:bookmarkStart w:id="62" w:name="_34cdd4da43187dcb8dcb7dab8cfc754babbf6ae"/>
       <w:r>
         <w:t xml:space="preserve">Recovery while protection may be required</w:t>
       </w:r>
-      <w:bookmarkEnd w:id="59"/>
+      <w:bookmarkEnd w:id="62"/>
     </w:p>
     <w:p>
       <w:pPr>
@@ -5271,11 +5615,11 @@
       <w:pPr>
         <w:pStyle w:val="Heading2"/>
       </w:pPr>
-      <w:bookmarkStart w:id="60" w:name="_6883d371cfcfa3a5c3f412b0432d6a574a50f57"/>
+      <w:bookmarkStart w:id="63" w:name="_6883d371cfcfa3a5c3f412b0432d6a574a50f57"/>
       <w:r>
         <w:t xml:space="preserve">Synthesis admission and continual refinement</w:t>
       </w:r>
-      <w:bookmarkEnd w:id="60"/>
+      <w:bookmarkEnd w:id="63"/>
     </w:p>
     <w:p>
       <w:pPr>
@@ -5345,11 +5689,11 @@
       <w:pPr>
         <w:pStyle w:val="Heading3"/>
       </w:pPr>
-      <w:bookmarkStart w:id="61" w:name="_017518b323667e452aa79a8f06a92486d9b21df"/>
+      <w:bookmarkStart w:id="64" w:name="_017518b323667e452aa79a8f06a92486d9b21df"/>
       <w:r>
         <w:t xml:space="preserve">Concurrency belongs in the model</w:t>
       </w:r>
-      <w:bookmarkEnd w:id="61"/>
+      <w:bookmarkEnd w:id="64"/>
     </w:p>
     <w:p>
       <w:pPr>
@@ -5393,11 +5737,11 @@
       <w:pPr>
         <w:pStyle w:val="Heading3"/>
       </w:pPr>
-      <w:bookmarkStart w:id="62" w:name="_302ac15a5d60d0d6bdaad3ae490234076475a6c"/>
+      <w:bookmarkStart w:id="65" w:name="_302ac15a5d60d0d6bdaad3ae490234076475a6c"/>
       <w:r>
         <w:t xml:space="preserve">A hypothesis can improve</w:t>
       </w:r>
-      <w:bookmarkEnd w:id="62"/>
+      <w:bookmarkEnd w:id="65"/>
     </w:p>
     <w:p>
       <w:pPr>
@@ -5517,11 +5861,11 @@
       <w:pPr>
         <w:pStyle w:val="Heading3"/>
       </w:pPr>
-      <w:bookmarkStart w:id="63" w:name="_2e86f133e41f64edcf2067a425850c3772c91cb"/>
+      <w:bookmarkStart w:id="66" w:name="_2e86f133e41f64edcf2067a425850c3772c91cb"/>
       <w:r>
         <w:t xml:space="preserve">Bounded evidence and lazy decay</w:t>
       </w:r>
-      <w:bookmarkEnd w:id="63"/>
+      <w:bookmarkEnd w:id="66"/>
     </w:p>
     <w:p>
       <w:pPr>
@@ -5679,11 +6023,11 @@
       <w:pPr>
         <w:pStyle w:val="Heading2"/>
       </w:pPr>
-      <w:bookmarkStart w:id="64" w:name="_bd9cdb15164fa730878064703a47f63e6996460"/>
+      <w:bookmarkStart w:id="67" w:name="_bd9cdb15164fa730878064703a47f63e6996460"/>
       <w:r>
         <w:t xml:space="preserve">Time resources and execution bounds</w:t>
       </w:r>
-      <w:bookmarkEnd w:id="64"/>
+      <w:bookmarkEnd w:id="67"/>
     </w:p>
     <w:p>
       <w:pPr>
@@ -5923,11 +6267,11 @@
       <w:pPr>
         <w:pStyle w:val="Heading3"/>
       </w:pPr>
-      <w:bookmarkStart w:id="65" w:name="_5089bf1b1ddf9c9f069e876c9f8929e3fdb3c96"/>
+      <w:bookmarkStart w:id="68" w:name="_5089bf1b1ddf9c9f069e876c9f8929e3fdb3c96"/>
       <w:r>
         <w:t xml:space="preserve">Fixed capacity is part of correctness</w:t>
       </w:r>
-      <w:bookmarkEnd w:id="65"/>
+      <w:bookmarkEnd w:id="68"/>
     </w:p>
     <w:p>
       <w:pPr>
@@ -6023,11 +6367,11 @@
       <w:pPr>
         <w:pStyle w:val="Heading3"/>
       </w:pPr>
-      <w:bookmarkStart w:id="66" w:name="_1e778eb70cd1ac010c089da22c3b9244646acf1"/>
+      <w:bookmarkStart w:id="69" w:name="_1e778eb70cd1ac010c089da22c3b9244646acf1"/>
       <w:r>
         <w:t xml:space="preserve">Processor and platform choices</w:t>
       </w:r>
-      <w:bookmarkEnd w:id="66"/>
+      <w:bookmarkEnd w:id="69"/>
     </w:p>
     <w:p>
       <w:pPr>
@@ -6153,11 +6497,11 @@
       <w:pPr>
         <w:pStyle w:val="Heading2"/>
       </w:pPr>
-      <w:bookmarkStart w:id="67" w:name="_cc6b3a4f6b44a5c68f0df9e32bc0cce44548e27"/>
+      <w:bookmarkStart w:id="70" w:name="_cc6b3a4f6b44a5c68f0df9e32bc0cce44548e27"/>
       <w:r>
         <w:t xml:space="preserve">Trust authorization and operational boundaries</w:t>
       </w:r>
-      <w:bookmarkEnd w:id="67"/>
+      <w:bookmarkEnd w:id="70"/>
     </w:p>
     <w:p>
       <w:pPr>
@@ -6279,11 +6623,11 @@
       <w:pPr>
         <w:pStyle w:val="Heading2"/>
       </w:pPr>
-      <w:bookmarkStart w:id="68" w:name="_fd75010fd3162b1f7c1a41acd1b0fb466aa0f87"/>
+      <w:bookmarkStart w:id="71" w:name="_fd75010fd3162b1f7c1a41acd1b0fb466aa0f87"/>
       <w:r>
         <w:t xml:space="preserve">Architectural integrity</w:t>
       </w:r>
-      <w:bookmarkEnd w:id="68"/>
+      <w:bookmarkEnd w:id="71"/>
     </w:p>
     <w:p>
       <w:pPr>
@@ -6379,11 +6723,11 @@
       <w:pPr>
         <w:pStyle w:val="Heading2"/>
       </w:pPr>
-      <w:bookmarkStart w:id="69" w:name="_3397abd589780671299c583dd6b5eec3d2d40da"/>
+      <w:bookmarkStart w:id="72" w:name="_3397abd589780671299c583dd6b5eec3d2d40da"/>
       <w:r>
         <w:t xml:space="preserve">Research foundations and interpretation</w:t>
       </w:r>
-      <w:bookmarkEnd w:id="69"/>
+      <w:bookmarkEnd w:id="72"/>
     </w:p>
     <w:p>
       <w:pPr>
@@ -6435,141 +6779,6 @@
       </w:r>
       <w:r>
         <w:t xml:space="preserve">old-work drainage; not a delivery guarantee for arbitrary packet loss and reboot.</w:t>
-      </w:r>
-    </w:p>
-    <w:p>
-      <w:pPr>
-        <w:pStyle w:val="BodyText"/>
-      </w:pPr>
-      <w:hyperlink r:id="rId70">
-        <w:r>
-          <w:rPr>
-            <w:rStyle w:val="Hyperlink"/>
-          </w:rPr>
-          <w:t xml:space="preserve">Primary source</w:t>
-        </w:r>
-      </w:hyperlink>
-    </w:p>
-    <w:p>
-      <w:pPr>
-        <w:pStyle w:val="BodyText"/>
-      </w:pPr>
-      <w:r>
-        <w:rPr>
-          <w:b/>
-          <w:bCs/>
-        </w:rPr>
-        <w:t xml:space="preserve">[2] C Intanagonwiwat R Govindan and D Estrin Directed Diffusion 2000</w:t>
-      </w:r>
-    </w:p>
-    <w:p>
-      <w:pPr>
-        <w:pStyle w:val="BodyText"/>
-      </w:pPr>
-      <w:r>
-        <w:t xml:space="preserve">A primary comparison for local gradients, data-oriented communication, and empirical</w:t>
-      </w:r>
-      <w:r>
-        <w:t xml:space="preserve"> </w:t>
-      </w:r>
-      <w:r>
-        <w:t xml:space="preserve">reinforcement of useful paths. Lattice's typed binding references and program fragments</w:t>
-      </w:r>
-      <w:r>
-        <w:t xml:space="preserve"> </w:t>
-      </w:r>
-      <w:r>
-        <w:t xml:space="preserve">remain its own execution model.</w:t>
-      </w:r>
-    </w:p>
-    <w:p>
-      <w:pPr>
-        <w:pStyle w:val="BodyText"/>
-      </w:pPr>
-      <w:hyperlink r:id="rId71">
-        <w:r>
-          <w:rPr>
-            <w:rStyle w:val="Hyperlink"/>
-          </w:rPr>
-          <w:t xml:space="preserve">Primary source</w:t>
-        </w:r>
-      </w:hyperlink>
-    </w:p>
-    <w:p>
-      <w:pPr>
-        <w:pStyle w:val="BodyText"/>
-      </w:pPr>
-      <w:r>
-        <w:rPr>
-          <w:b/>
-          <w:bCs/>
-        </w:rPr>
-        <w:t xml:space="preserve">[3] P Levis N Patel D Culler and S Shenker Trickle 2004</w:t>
-      </w:r>
-    </w:p>
-    <w:p>
-      <w:pPr>
-        <w:pStyle w:val="BodyText"/>
-      </w:pPr>
-      <w:r>
-        <w:t xml:space="preserve">Demonstrates local suppression of redundant dissemination. Suppression does not establish</w:t>
-      </w:r>
-      <w:r>
-        <w:t xml:space="preserve"> </w:t>
-      </w:r>
-      <w:r>
-        <w:t xml:space="preserve">execution completion, and adopting its ideas does not select every timing or forwarding</w:t>
-      </w:r>
-      <w:r>
-        <w:t xml:space="preserve"> </w:t>
-      </w:r>
-      <w:r>
-        <w:t xml:space="preserve">rule for this kernel.</w:t>
-      </w:r>
-    </w:p>
-    <w:p>
-      <w:pPr>
-        <w:pStyle w:val="BodyText"/>
-      </w:pPr>
-      <w:hyperlink r:id="rId72">
-        <w:r>
-          <w:rPr>
-            <w:rStyle w:val="Hyperlink"/>
-          </w:rPr>
-          <w:t xml:space="preserve">Primary source</w:t>
-        </w:r>
-      </w:hyperlink>
-    </w:p>
-    <w:p>
-      <w:pPr>
-        <w:pStyle w:val="BodyText"/>
-      </w:pPr>
-      <w:r>
-        <w:rPr>
-          <w:b/>
-          <w:bCs/>
-        </w:rPr>
-        <w:t xml:space="preserve">[4] T D Chandra and S Toueg Unreliable Failure Detectors for Reliable Distributed Systems 1996</w:t>
-      </w:r>
-    </w:p>
-    <w:p>
-      <w:pPr>
-        <w:pStyle w:val="BodyText"/>
-      </w:pPr>
-      <w:r>
-        <w:t xml:space="preserve">Provides the formal context for failure suspicion in asynchronous systems. A local</w:t>
-      </w:r>
-      <w:r>
-        <w:t xml:space="preserve"> </w:t>
-      </w:r>
-      <w:r>
-        <w:t xml:space="preserve">watchdog enforces a freshness requirement and response deadline; it does not perfectly</w:t>
-      </w:r>
-      <w:r>
-        <w:t xml:space="preserve"> </w:t>
-      </w:r>
-      <w:r>
-        <w:t xml:space="preserve">distinguish a failed peer from an arbitrarily delayed one.</w:t>
       </w:r>
     </w:p>
     <w:p>
@@ -6594,27 +6803,27 @@
           <w:b/>
           <w:bCs/>
         </w:rPr>
-        <w:t xml:space="preserve">[5] M Reitblatt and colleagues Abstractions for Network Update 2012</w:t>
-      </w:r>
-    </w:p>
-    <w:p>
-      <w:pPr>
-        <w:pStyle w:val="BodyText"/>
-      </w:pPr>
-      <w:r>
-        <w:t xml:space="preserve">A reference for staged replacement that preserves a coherent configuration for an</w:t>
-      </w:r>
-      <w:r>
-        <w:t xml:space="preserve"> </w:t>
-      </w:r>
-      <w:r>
-        <w:t xml:space="preserve">individual traversal. Its controller architecture is not a prescription for Lattice's peer</w:t>
-      </w:r>
-      <w:r>
-        <w:t xml:space="preserve"> </w:t>
-      </w:r>
-      <w:r>
-        <w:t xml:space="preserve">topology.</w:t>
+        <w:t xml:space="preserve">[2] C Intanagonwiwat R Govindan and D Estrin Directed Diffusion 2000</w:t>
+      </w:r>
+    </w:p>
+    <w:p>
+      <w:pPr>
+        <w:pStyle w:val="BodyText"/>
+      </w:pPr>
+      <w:r>
+        <w:t xml:space="preserve">A primary comparison for local gradients, data-oriented communication, and empirical</w:t>
+      </w:r>
+      <w:r>
+        <w:t xml:space="preserve"> </w:t>
+      </w:r>
+      <w:r>
+        <w:t xml:space="preserve">reinforcement of useful paths. Lattice's typed binding references and program fragments</w:t>
+      </w:r>
+      <w:r>
+        <w:t xml:space="preserve"> </w:t>
+      </w:r>
+      <w:r>
+        <w:t xml:space="preserve">remain its own execution model.</w:t>
       </w:r>
     </w:p>
     <w:p>
@@ -6639,6 +6848,141 @@
           <w:b/>
           <w:bCs/>
         </w:rPr>
+        <w:t xml:space="preserve">[3] P Levis N Patel D Culler and S Shenker Trickle 2004</w:t>
+      </w:r>
+    </w:p>
+    <w:p>
+      <w:pPr>
+        <w:pStyle w:val="BodyText"/>
+      </w:pPr>
+      <w:r>
+        <w:t xml:space="preserve">Demonstrates local suppression of redundant dissemination. Suppression does not establish</w:t>
+      </w:r>
+      <w:r>
+        <w:t xml:space="preserve"> </w:t>
+      </w:r>
+      <w:r>
+        <w:t xml:space="preserve">execution completion, and adopting its ideas does not select every timing or forwarding</w:t>
+      </w:r>
+      <w:r>
+        <w:t xml:space="preserve"> </w:t>
+      </w:r>
+      <w:r>
+        <w:t xml:space="preserve">rule for this kernel.</w:t>
+      </w:r>
+    </w:p>
+    <w:p>
+      <w:pPr>
+        <w:pStyle w:val="BodyText"/>
+      </w:pPr>
+      <w:hyperlink r:id="rId75">
+        <w:r>
+          <w:rPr>
+            <w:rStyle w:val="Hyperlink"/>
+          </w:rPr>
+          <w:t xml:space="preserve">Primary source</w:t>
+        </w:r>
+      </w:hyperlink>
+    </w:p>
+    <w:p>
+      <w:pPr>
+        <w:pStyle w:val="BodyText"/>
+      </w:pPr>
+      <w:r>
+        <w:rPr>
+          <w:b/>
+          <w:bCs/>
+        </w:rPr>
+        <w:t xml:space="preserve">[4] T D Chandra and S Toueg Unreliable Failure Detectors for Reliable Distributed Systems 1996</w:t>
+      </w:r>
+    </w:p>
+    <w:p>
+      <w:pPr>
+        <w:pStyle w:val="BodyText"/>
+      </w:pPr>
+      <w:r>
+        <w:t xml:space="preserve">Provides the formal context for failure suspicion in asynchronous systems. A local</w:t>
+      </w:r>
+      <w:r>
+        <w:t xml:space="preserve"> </w:t>
+      </w:r>
+      <w:r>
+        <w:t xml:space="preserve">watchdog enforces a freshness requirement and response deadline; it does not perfectly</w:t>
+      </w:r>
+      <w:r>
+        <w:t xml:space="preserve"> </w:t>
+      </w:r>
+      <w:r>
+        <w:t xml:space="preserve">distinguish a failed peer from an arbitrarily delayed one.</w:t>
+      </w:r>
+    </w:p>
+    <w:p>
+      <w:pPr>
+        <w:pStyle w:val="BodyText"/>
+      </w:pPr>
+      <w:hyperlink r:id="rId76">
+        <w:r>
+          <w:rPr>
+            <w:rStyle w:val="Hyperlink"/>
+          </w:rPr>
+          <w:t xml:space="preserve">Primary source</w:t>
+        </w:r>
+      </w:hyperlink>
+    </w:p>
+    <w:p>
+      <w:pPr>
+        <w:pStyle w:val="BodyText"/>
+      </w:pPr>
+      <w:r>
+        <w:rPr>
+          <w:b/>
+          <w:bCs/>
+        </w:rPr>
+        <w:t xml:space="preserve">[5] M Reitblatt and colleagues Abstractions for Network Update 2012</w:t>
+      </w:r>
+    </w:p>
+    <w:p>
+      <w:pPr>
+        <w:pStyle w:val="BodyText"/>
+      </w:pPr>
+      <w:r>
+        <w:t xml:space="preserve">A reference for staged replacement that preserves a coherent configuration for an</w:t>
+      </w:r>
+      <w:r>
+        <w:t xml:space="preserve"> </w:t>
+      </w:r>
+      <w:r>
+        <w:t xml:space="preserve">individual traversal. Its controller architecture is not a prescription for Lattice's peer</w:t>
+      </w:r>
+      <w:r>
+        <w:t xml:space="preserve"> </w:t>
+      </w:r>
+      <w:r>
+        <w:t xml:space="preserve">topology.</w:t>
+      </w:r>
+    </w:p>
+    <w:p>
+      <w:pPr>
+        <w:pStyle w:val="BodyText"/>
+      </w:pPr>
+      <w:hyperlink r:id="rId77">
+        <w:r>
+          <w:rPr>
+            <w:rStyle w:val="Hyperlink"/>
+          </w:rPr>
+          <w:t xml:space="preserve">Primary source</w:t>
+        </w:r>
+      </w:hyperlink>
+    </w:p>
+    <w:p>
+      <w:pPr>
+        <w:pStyle w:val="BodyText"/>
+      </w:pPr>
+      <w:r>
+        <w:rPr>
+          <w:b/>
+          <w:bCs/>
+        </w:rPr>
         <w:t xml:space="preserve">[6] A D Birrell and B J Nelson Implementing Remote Procedure Calls 1984</w:t>
       </w:r>
     </w:p>
@@ -6666,7 +7010,7 @@
       <w:pPr>
         <w:pStyle w:val="BodyText"/>
       </w:pPr>
-      <w:hyperlink r:id="rId75">
+      <w:hyperlink r:id="rId78">
         <w:r>
           <w:rPr>
             <w:rStyle w:val="Hyperlink"/>

</xml_diff>